<commit_message>
feat: add resume suggestions and history features (P0)
- Add suggestions and resume_content fields to students table
- Create resume_parse_history table for tracking resume parsing
- Add SoftSkills type definition to API
- Add suggestions field to StudentProfile
- Update AI prompt to generate optimization suggestions
- Implement database save logic in UploadResumeLogic
- Create resume_parse_history_model with full CRUD operations
- Update ServiceContext to include new model

This commit includes P0 priority features for resume optimization and history tracking.
</commit_message>
<xml_diff>
--- a/test/黑白设计通用国际贸易财务会计专业简历.docx
+++ b/test/黑白设计通用国际贸易财务会计专业简历.docx
@@ -126,7 +126,7 @@
           </mc:Choice>
           <mc:Fallback>
             <w:pict>
-              <v:shape id="矩形 66" o:spid="_x0000_s1026" o:spt="61" type="#_x0000_t61" style="height:32.2pt;width:84.25pt;mso-wrap-style:none;v-text-anchor:middle;" fillcolor="#373D54 [3204]" filled="t" stroked="f" coordsize="21600,21600" o:gfxdata="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" adj="23878,10603">
+              <v:shape id="矩形 66" o:spid="_x0000_s1026" o:spt="61" type="#_x0000_t61" style="height:32.2pt;width:84.25pt;mso-wrap-style:none;v-text-anchor:middle;" fillcolor="#373D54 [3204]" filled="t" stroked="f" coordsize="21600,21600" o:gfxdata="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" adj="23878,10603">
                 <v:fill on="t" focussize="0,0"/>
                 <v:stroke on="f" weight="1pt" miterlimit="8" joinstyle="miter"/>
                 <v:imagedata o:title=""/>
@@ -170,7 +170,27 @@
         <w:rPr>
           <w:rFonts w:hint="eastAsia" w:ascii="MiSans" w:hAnsi="MiSans" w:eastAsia="MiSans" w:cs="MiSans"/>
         </w:rPr>
-        <w:t>出生年月：20XX.0X</w:t>
+        <w:t>出生年月：20</w:t>
+      </w:r>
+      <w:r>
+        <w:rPr>
+          <w:rFonts w:hint="default" w:ascii="MiSans" w:hAnsi="MiSans" w:eastAsia="MiSans" w:cs="MiSans"/>
+          <w:lang w:val="en-US"/>
+        </w:rPr>
+        <w:t>06</w:t>
+      </w:r>
+      <w:r>
+        <w:rPr>
+          <w:rFonts w:hint="eastAsia" w:ascii="MiSans" w:hAnsi="MiSans" w:eastAsia="MiSans" w:cs="MiSans"/>
+        </w:rPr>
+        <w:t>.</w:t>
+      </w:r>
+      <w:r>
+        <w:rPr>
+          <w:rFonts w:hint="default" w:ascii="MiSans" w:hAnsi="MiSans" w:eastAsia="MiSans" w:cs="MiSans"/>
+          <w:lang w:val="en-US"/>
+        </w:rPr>
+        <w:t>8</w:t>
       </w:r>
       <w:r>
         <w:rPr>
@@ -230,7 +250,21 @@
         <w:rPr>
           <w:rFonts w:hint="eastAsia" w:ascii="MiSans" w:hAnsi="MiSans" w:eastAsia="MiSans" w:cs="MiSans"/>
         </w:rPr>
-        <w:t>求职意向：专业相关实习岗位</w:t>
+        <w:t>求职意向：</w:t>
+      </w:r>
+      <w:r>
+        <w:rPr>
+          <w:rFonts w:hint="default" w:ascii="MiSans" w:hAnsi="MiSans" w:eastAsia="MiSans" w:cs="MiSans"/>
+          <w:lang w:val="en-US"/>
+        </w:rPr>
+        <w:t>Golang</w:t>
+      </w:r>
+      <w:r>
+        <w:rPr>
+          <w:rFonts w:hint="eastAsia" w:ascii="MiSans" w:hAnsi="MiSans" w:eastAsia="MiSans" w:cs="MiSans"/>
+          <w:lang w:val="en-US" w:eastAsia="zh-CN"/>
+        </w:rPr>
+        <w:t>软件开发岗</w:t>
       </w:r>
       <w:r>
         <w:rPr>
@@ -435,17 +469,17 @@
           </mc:Choice>
           <mc:Fallback>
             <w:pict>
-              <v:group id="组合 3" o:spid="_x0000_s1026" o:spt="203" style="height:27.65pt;width:507.65pt;" coordorigin="4100,0" coordsize="6447790,351289" o:gfxdata="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">
+              <v:group id="组合 3" o:spid="_x0000_s1026" o:spt="203" style="height:27.65pt;width:507.65pt;" coordorigin="4100,0" coordsize="6447790,351289" o:gfxdata="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">
                 <o:lock v:ext="edit" aspectratio="f"/>
-                <v:group id="组合 3" o:spid="_x0000_s1026" o:spt="203" style="position:absolute;left:4100;top:0;height:351289;width:6447790;" coordorigin="10020,-1462" coordsize="6447881,351289" o:gfxdata="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">
+                <v:group id="组合 3" o:spid="_x0000_s1026" o:spt="203" style="position:absolute;left:4100;top:0;height:351289;width:6447790;" coordorigin="10020,-1462" coordsize="6447881,351289" o:gfxdata="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">
                   <o:lock v:ext="edit" aspectratio="f"/>
-                  <v:line id="直接连接符 1" o:spid="_x0000_s1026" o:spt="20" style="position:absolute;left:10020;top:349827;height:0;width:6447881;" filled="f" stroked="t" coordsize="21600,21600" o:gfxdata="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">
+                  <v:line id="直接连接符 1" o:spid="_x0000_s1026" o:spt="20" style="position:absolute;left:10020;top:349827;height:0;width:6447881;" filled="f" stroked="t" coordsize="21600,21600" o:gfxdata="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">
                     <v:fill on="f" focussize="0,0"/>
                     <v:stroke weight="1pt" color="#BFBFBF" miterlimit="8" joinstyle="miter"/>
                     <v:imagedata o:title=""/>
                     <o:lock v:ext="edit" aspectratio="f"/>
                   </v:line>
-                  <v:rect id="矩形 66" o:spid="_x0000_s1026" o:spt="1" style="position:absolute;left:350812;top:-1462;height:308728;width:1084599;mso-wrap-style:none;v-text-anchor:middle;" filled="f" stroked="f" coordsize="21600,21600" o:gfxdata="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">
+                  <v:rect id="矩形 66" o:spid="_x0000_s1026" o:spt="1" style="position:absolute;left:350812;top:-1462;height:308728;width:1084599;mso-wrap-style:none;v-text-anchor:middle;" filled="f" stroked="f" coordsize="21600,21600" o:gfxdata="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">
                     <v:fill on="f" focussize="0,0"/>
                     <v:stroke on="f" weight="1pt" miterlimit="8" joinstyle="miter"/>
                     <v:imagedata o:title=""/>
@@ -467,13 +501,13 @@
                     </v:textbox>
                   </v:rect>
                 </v:group>
-                <v:shape id="椭圆 2" o:spid="_x0000_s1026" o:spt="5" type="#_x0000_t5" style="position:absolute;left:126138;top:67796;height:180148;width:257338;rotation:5898240f;v-text-anchor:middle;" fillcolor="#373D54 [3204]" filled="t" stroked="t" coordsize="21600,21600" o:gfxdata="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" adj="10800">
+                <v:shape id="椭圆 2" o:spid="_x0000_s1026" o:spt="5" type="#_x0000_t5" style="position:absolute;left:126138;top:67796;height:180148;width:257338;rotation:5898240f;v-text-anchor:middle;" fillcolor="#373D54 [3204]" filled="t" stroked="t" coordsize="21600,21600" o:gfxdata="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" adj="10800">
                   <v:fill on="t" focussize="0,0"/>
                   <v:stroke weight="1.5pt" color="#FFFFFF [3212]" miterlimit="8" joinstyle="miter"/>
                   <v:imagedata o:title=""/>
                   <o:lock v:ext="edit" aspectratio="f"/>
                 </v:shape>
-                <v:shape id="椭圆 2" o:spid="_x0000_s1026" o:spt="5" type="#_x0000_t5" style="position:absolute;left:-8248;top:67794;height:180150;width:257340;rotation:5898240f;v-text-anchor:middle;" fillcolor="#373D54 [3204]" filled="t" stroked="t" coordsize="21600,21600" o:gfxdata="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" adj="10800">
+                <v:shape id="椭圆 2" o:spid="_x0000_s1026" o:spt="5" type="#_x0000_t5" style="position:absolute;left:-8248;top:67794;height:180150;width:257340;rotation:5898240f;v-text-anchor:middle;" fillcolor="#373D54 [3204]" filled="t" stroked="t" coordsize="21600,21600" o:gfxdata="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" adj="10800">
                   <v:fill on="t" focussize="0,0"/>
                   <v:stroke weight="1.5pt" color="#FFFFFF [3212]" miterlimit="8" joinstyle="miter"/>
                   <v:imagedata o:title=""/>
@@ -499,7 +533,33 @@
         <w:rPr>
           <w:rFonts w:hint="eastAsia" w:ascii="MiSans" w:hAnsi="MiSans" w:eastAsia="MiSans" w:cs="MiSans"/>
         </w:rPr>
-        <w:t>20XX.XX – 20XX.XX</w:t>
+        <w:t>20</w:t>
+      </w:r>
+      <w:r>
+        <w:rPr>
+          <w:rFonts w:hint="eastAsia" w:ascii="MiSans" w:hAnsi="MiSans" w:eastAsia="MiSans" w:cs="MiSans"/>
+          <w:lang w:val="en-US" w:eastAsia="zh-CN"/>
+        </w:rPr>
+        <w:t>24</w:t>
+      </w:r>
+      <w:r>
+        <w:rPr>
+          <w:rFonts w:hint="eastAsia" w:ascii="MiSans" w:hAnsi="MiSans" w:eastAsia="MiSans" w:cs="MiSans"/>
+        </w:rPr>
+        <w:t>.XX – 20</w:t>
+      </w:r>
+      <w:r>
+        <w:rPr>
+          <w:rFonts w:hint="eastAsia" w:ascii="MiSans" w:hAnsi="MiSans" w:eastAsia="MiSans" w:cs="MiSans"/>
+          <w:lang w:val="en-US" w:eastAsia="zh-CN"/>
+        </w:rPr>
+        <w:t>28</w:t>
+      </w:r>
+      <w:r>
+        <w:rPr>
+          <w:rFonts w:hint="eastAsia" w:ascii="MiSans" w:hAnsi="MiSans" w:eastAsia="MiSans" w:cs="MiSans"/>
+        </w:rPr>
+        <w:t>.XX</w:t>
       </w:r>
       <w:r>
         <w:rPr>
@@ -510,9 +570,16 @@
       <w:r>
         <w:rPr>
           <w:rFonts w:hint="eastAsia" w:ascii="MiSans" w:hAnsi="MiSans" w:eastAsia="MiSans" w:cs="MiSans"/>
+          <w:lang w:eastAsia="zh-CN"/>
+        </w:rPr>
+        <w:t>浙江师范</w:t>
+      </w:r>
+      <w:r>
+        <w:rPr>
+          <w:rFonts w:hint="eastAsia" w:ascii="MiSans" w:hAnsi="MiSans" w:eastAsia="MiSans" w:cs="MiSans"/>
           <w:lang w:val="en-US" w:eastAsia="zh-CN"/>
         </w:rPr>
-        <w:t>简历大学</w:t>
+        <w:t>大学</w:t>
       </w:r>
       <w:r>
         <w:rPr>
@@ -523,8 +590,15 @@
       <w:r>
         <w:rPr>
           <w:rFonts w:hint="eastAsia" w:ascii="MiSans" w:hAnsi="MiSans" w:eastAsia="MiSans" w:cs="MiSans"/>
-        </w:rPr>
-        <w:t>国贸专业 / 本科</w:t>
+          <w:lang w:eastAsia="zh-CN"/>
+        </w:rPr>
+        <w:t>软件工程</w:t>
+      </w:r>
+      <w:r>
+        <w:rPr>
+          <w:rFonts w:hint="eastAsia" w:ascii="MiSans" w:hAnsi="MiSans" w:eastAsia="MiSans" w:cs="MiSans"/>
+        </w:rPr>
+        <w:t>专业 / 本科</w:t>
       </w:r>
     </w:p>
     <w:p>
@@ -545,14 +619,37 @@
       <w:pPr>
         <w:pStyle w:val="17"/>
         <w:rPr>
-          <w:rFonts w:hint="eastAsia" w:ascii="MiSans" w:hAnsi="MiSans" w:eastAsia="MiSans" w:cs="MiSans"/>
-        </w:rPr>
-      </w:pPr>
-      <w:r>
-        <w:rPr>
-          <w:rFonts w:hint="eastAsia" w:ascii="MiSans" w:hAnsi="MiSans" w:eastAsia="MiSans" w:cs="MiSans"/>
-        </w:rPr>
-        <w:t>国际经济学、计量经济学、世界经济概论、国际贸易理论与实务、国际金融、国际结算、货币银行学、财政学、会计学、统计学、管理学原理、国际商法、中国对外贸易、外贸运输与保险</w:t>
+          <w:rFonts w:hint="default" w:eastAsia="MiSans"/>
+          <w:lang w:val="en-US" w:eastAsia="zh-CN"/>
+        </w:rPr>
+      </w:pPr>
+      <w:r>
+        <w:rPr>
+          <w:rFonts w:hint="default" w:ascii="MiSans" w:hAnsi="MiSans" w:eastAsia="MiSans" w:cs="MiSans"/>
+          <w:lang w:val="en-US"/>
+        </w:rPr>
+        <w:t>Golang</w:t>
+      </w:r>
+      <w:r>
+        <w:rPr>
+          <w:rFonts w:hint="eastAsia" w:ascii="MiSans" w:hAnsi="MiSans" w:eastAsia="MiSans" w:cs="MiSans"/>
+          <w:lang w:val="en-US" w:eastAsia="zh-CN"/>
+        </w:rPr>
+        <w:t>程序设计，rust 程序设计</w:t>
+      </w:r>
+      <w:r>
+        <w:rPr>
+          <w:rFonts w:hint="default" w:ascii="MiSans" w:hAnsi="MiSans" w:eastAsia="MiSans" w:cs="MiSans"/>
+          <w:lang w:val="en-US" w:eastAsia="zh-CN"/>
+        </w:rPr>
+        <w:t>,</w:t>
+      </w:r>
+      <w:r>
+        <w:rPr>
+          <w:rFonts w:hint="eastAsia" w:ascii="MiSans" w:hAnsi="MiSans" w:eastAsia="MiSans" w:cs="MiSans"/>
+          <w:lang w:val="en-US" w:eastAsia="zh-CN"/>
+        </w:rPr>
+        <w:t>现代web开发，云原生开发，操作系统</w:t>
       </w:r>
     </w:p>
     <w:p>
@@ -745,17 +842,17 @@
           </mc:Choice>
           <mc:Fallback>
             <w:pict>
-              <v:group id="组合 3" o:spid="_x0000_s1026" o:spt="203" style="height:27.65pt;width:507.65pt;" coordorigin="4100,0" coordsize="6447790,351289" o:gfxdata="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">
+              <v:group id="组合 3" o:spid="_x0000_s1026" o:spt="203" style="height:27.65pt;width:507.65pt;" coordorigin="4100,0" coordsize="6447790,351289" o:gfxdata="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">
                 <o:lock v:ext="edit" aspectratio="f"/>
-                <v:group id="组合 3" o:spid="_x0000_s1026" o:spt="203" style="position:absolute;left:4100;top:0;height:351289;width:6447790;" coordorigin="10020,-1462" coordsize="6447881,351289" o:gfxdata="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">
+                <v:group id="组合 3" o:spid="_x0000_s1026" o:spt="203" style="position:absolute;left:4100;top:0;height:351289;width:6447790;" coordorigin="10020,-1462" coordsize="6447881,351289" o:gfxdata="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">
                   <o:lock v:ext="edit" aspectratio="f"/>
-                  <v:line id="直接连接符 1" o:spid="_x0000_s1026" o:spt="20" style="position:absolute;left:10020;top:349827;height:0;width:6447881;" filled="f" stroked="t" coordsize="21600,21600" o:gfxdata="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">
+                  <v:line id="直接连接符 1" o:spid="_x0000_s1026" o:spt="20" style="position:absolute;left:10020;top:349827;height:0;width:6447881;" filled="f" stroked="t" coordsize="21600,21600" o:gfxdata="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">
                     <v:fill on="f" focussize="0,0"/>
                     <v:stroke weight="1pt" color="#BFBFBF" miterlimit="8" joinstyle="miter"/>
                     <v:imagedata o:title=""/>
                     <o:lock v:ext="edit" aspectratio="f"/>
                   </v:line>
-                  <v:rect id="矩形 66" o:spid="_x0000_s1026" o:spt="1" style="position:absolute;left:350758;top:-1462;height:308728;width:1084599;mso-wrap-style:none;v-text-anchor:middle;" filled="f" stroked="f" coordsize="21600,21600" o:gfxdata="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">
+                  <v:rect id="矩形 66" o:spid="_x0000_s1026" o:spt="1" style="position:absolute;left:350758;top:-1462;height:308728;width:1084599;mso-wrap-style:none;v-text-anchor:middle;" filled="f" stroked="f" coordsize="21600,21600" o:gfxdata="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">
                     <v:fill on="f" focussize="0,0"/>
                     <v:stroke on="f" weight="1pt" miterlimit="8" joinstyle="miter"/>
                     <v:imagedata o:title=""/>
@@ -777,13 +874,13 @@
                     </v:textbox>
                   </v:rect>
                 </v:group>
-                <v:shape id="椭圆 2" o:spid="_x0000_s1026" o:spt="5" type="#_x0000_t5" style="position:absolute;left:126138;top:67796;height:180148;width:257338;rotation:5898240f;v-text-anchor:middle;" fillcolor="#373D54 [3204]" filled="t" stroked="t" coordsize="21600,21600" o:gfxdata="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" adj="10800">
+                <v:shape id="椭圆 2" o:spid="_x0000_s1026" o:spt="5" type="#_x0000_t5" style="position:absolute;left:126138;top:67796;height:180148;width:257338;rotation:5898240f;v-text-anchor:middle;" fillcolor="#373D54 [3204]" filled="t" stroked="t" coordsize="21600,21600" o:gfxdata="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" adj="10800">
                   <v:fill on="t" focussize="0,0"/>
                   <v:stroke weight="1.5pt" color="#FFFFFF [3212]" miterlimit="8" joinstyle="miter"/>
                   <v:imagedata o:title=""/>
                   <o:lock v:ext="edit" aspectratio="f"/>
                 </v:shape>
-                <v:shape id="椭圆 2" o:spid="_x0000_s1026" o:spt="5" type="#_x0000_t5" style="position:absolute;left:-8248;top:67794;height:180150;width:257340;rotation:5898240f;v-text-anchor:middle;" fillcolor="#373D54 [3204]" filled="t" stroked="t" coordsize="21600,21600" o:gfxdata="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" adj="10800">
+                <v:shape id="椭圆 2" o:spid="_x0000_s1026" o:spt="5" type="#_x0000_t5" style="position:absolute;left:-8248;top:67794;height:180150;width:257340;rotation:5898240f;v-text-anchor:middle;" fillcolor="#373D54 [3204]" filled="t" stroked="t" coordsize="21600,21600" o:gfxdata="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" adj="10800">
                   <v:fill on="t" focussize="0,0"/>
                   <v:stroke weight="1.5pt" color="#FFFFFF [3212]" miterlimit="8" joinstyle="miter"/>
                   <v:imagedata o:title=""/>
@@ -809,7 +906,33 @@
         <w:rPr>
           <w:rFonts w:hint="eastAsia" w:ascii="MiSans" w:hAnsi="MiSans" w:eastAsia="MiSans" w:cs="MiSans"/>
         </w:rPr>
-        <w:t>20XX.XX – 20XX.XX</w:t>
+        <w:t>20</w:t>
+      </w:r>
+      <w:r>
+        <w:rPr>
+          <w:rFonts w:hint="eastAsia" w:ascii="MiSans" w:hAnsi="MiSans" w:eastAsia="MiSans" w:cs="MiSans"/>
+          <w:lang w:val="en-US" w:eastAsia="zh-CN"/>
+        </w:rPr>
+        <w:t>24</w:t>
+      </w:r>
+      <w:r>
+        <w:rPr>
+          <w:rFonts w:hint="eastAsia" w:ascii="MiSans" w:hAnsi="MiSans" w:eastAsia="MiSans" w:cs="MiSans"/>
+        </w:rPr>
+        <w:t>.XX – 20</w:t>
+      </w:r>
+      <w:r>
+        <w:rPr>
+          <w:rFonts w:hint="eastAsia" w:ascii="MiSans" w:hAnsi="MiSans" w:eastAsia="MiSans" w:cs="MiSans"/>
+          <w:lang w:val="en-US" w:eastAsia="zh-CN"/>
+        </w:rPr>
+        <w:t>25</w:t>
+      </w:r>
+      <w:r>
+        <w:rPr>
+          <w:rFonts w:hint="eastAsia" w:ascii="MiSans" w:hAnsi="MiSans" w:eastAsia="MiSans" w:cs="MiSans"/>
+        </w:rPr>
+        <w:t>.XX</w:t>
       </w:r>
       <w:r>
         <w:rPr>
@@ -820,13 +943,6 @@
       <w:r>
         <w:rPr>
           <w:rFonts w:hint="eastAsia" w:ascii="MiSans" w:hAnsi="MiSans" w:eastAsia="MiSans" w:cs="MiSans"/>
-          <w:lang w:val="en-US" w:eastAsia="zh-CN"/>
-        </w:rPr>
-        <w:t>简历大学</w:t>
-      </w:r>
-      <w:r>
-        <w:rPr>
-          <w:rFonts w:hint="eastAsia" w:ascii="MiSans" w:hAnsi="MiSans" w:eastAsia="MiSans" w:cs="MiSans"/>
         </w:rPr>
         <w:tab/>
       </w:r>
@@ -834,7 +950,7 @@
         <w:rPr>
           <w:rFonts w:hint="eastAsia" w:ascii="MiSans" w:hAnsi="MiSans" w:eastAsia="MiSans" w:cs="MiSans"/>
         </w:rPr>
-        <w:t>课程作业</w:t>
+        <w:t>分布式博客系统</w:t>
       </w:r>
     </w:p>
     <w:p>
@@ -865,16 +981,9 @@
       <w:r>
         <w:rPr>
           <w:rFonts w:hint="eastAsia" w:ascii="MiSans" w:hAnsi="MiSans" w:eastAsia="MiSans" w:cs="MiSans"/>
-        </w:rPr>
-        <w:t>根据公司的拓展规模以及年度的经营目标，制订有效的采购目标和采购计</w:t>
-      </w:r>
-      <w:bookmarkStart w:id="0" w:name="_GoBack"/>
-      <w:bookmarkEnd w:id="0"/>
-      <w:r>
-        <w:rPr>
-          <w:rFonts w:hint="eastAsia" w:ascii="MiSans" w:hAnsi="MiSans" w:eastAsia="MiSans" w:cs="MiSans"/>
-        </w:rPr>
-        <w:t>划，确保供应所需生产物资；</w:t>
+          <w:lang w:eastAsia="zh-CN"/>
+        </w:rPr>
+        <w:t>基于 Golang + Gin 框架开发后端服务，设计并实现用户认证、文章发布、评论管理等核心模块，结合 JWT 完成身份鉴权；</w:t>
       </w:r>
     </w:p>
     <w:p>
@@ -892,7 +1001,7 @@
         <w:rPr>
           <w:rFonts w:hint="eastAsia" w:ascii="MiSans" w:hAnsi="MiSans" w:eastAsia="MiSans" w:cs="MiSans"/>
         </w:rPr>
-        <w:t>编制年度采购预算，实施采购的预防控制和过程控制，有效降低成本，对采购合同进行监督检查；</w:t>
+        <w:t>使用 GORM 实现 MySQL 数据库交互，优化慢查询，提升接口响应效率；</w:t>
       </w:r>
     </w:p>
     <w:p>
@@ -910,7 +1019,7 @@
         <w:rPr>
           <w:rFonts w:hint="eastAsia" w:ascii="MiSans" w:hAnsi="MiSans" w:eastAsia="MiSans" w:cs="MiSans"/>
         </w:rPr>
-        <w:t>根据公司的物质需求，选定价格合理、货物质量可靠、信誉好服务优质的供应厂商，建立长期战略同盟。</w:t>
+        <w:t>基于 Redis 实现缓存层，降低数据库访问压力，并利用 RabbitMQ 处理异步任务，提升系统吞吐能力。</w:t>
       </w:r>
     </w:p>
     <w:p>
@@ -925,24 +1034,44 @@
         <w:rPr>
           <w:rFonts w:hint="eastAsia" w:ascii="MiSans" w:hAnsi="MiSans" w:eastAsia="MiSans" w:cs="MiSans"/>
         </w:rPr>
-        <w:t>20XX.XX – 20XX.XX</w:t>
-      </w:r>
-      <w:r>
-        <w:rPr>
-          <w:rFonts w:hint="eastAsia" w:ascii="MiSans" w:hAnsi="MiSans" w:eastAsia="MiSans" w:cs="MiSans"/>
+        <w:t>20</w:t>
+      </w:r>
+      <w:r>
+        <w:rPr>
+          <w:rFonts w:hint="eastAsia" w:ascii="MiSans" w:hAnsi="MiSans" w:eastAsia="MiSans" w:cs="MiSans"/>
+          <w:lang w:val="en-US" w:eastAsia="zh-CN"/>
+        </w:rPr>
+        <w:t>25</w:t>
+      </w:r>
+      <w:r>
+        <w:rPr>
+          <w:rFonts w:hint="eastAsia" w:ascii="MiSans" w:hAnsi="MiSans" w:eastAsia="MiSans" w:cs="MiSans"/>
+        </w:rPr>
+        <w:t>.XX – 20</w:t>
+      </w:r>
+      <w:r>
+        <w:rPr>
+          <w:rFonts w:hint="eastAsia" w:ascii="MiSans" w:hAnsi="MiSans" w:eastAsia="MiSans" w:cs="MiSans"/>
+          <w:lang w:val="en-US" w:eastAsia="zh-CN"/>
+        </w:rPr>
+        <w:t>26</w:t>
+      </w:r>
+      <w:r>
+        <w:rPr>
+          <w:rFonts w:hint="eastAsia" w:ascii="MiSans" w:hAnsi="MiSans" w:eastAsia="MiSans" w:cs="MiSans"/>
+        </w:rPr>
+        <w:t>.XX</w:t>
+      </w:r>
+      <w:r>
+        <w:rPr>
+          <w:rFonts w:hint="eastAsia" w:ascii="MiSans" w:hAnsi="MiSans" w:eastAsia="MiSans" w:cs="MiSans"/>
+          <w:lang w:val="en-US" w:eastAsia="zh-CN"/>
         </w:rPr>
         <w:tab/>
       </w:r>
       <w:r>
         <w:rPr>
           <w:rFonts w:hint="eastAsia" w:ascii="MiSans" w:hAnsi="MiSans" w:eastAsia="MiSans" w:cs="MiSans"/>
-          <w:lang w:val="en-US" w:eastAsia="zh-CN"/>
-        </w:rPr>
-        <w:t>简历大学</w:t>
-      </w:r>
-      <w:r>
-        <w:rPr>
-          <w:rFonts w:hint="eastAsia" w:ascii="MiSans" w:hAnsi="MiSans" w:eastAsia="MiSans" w:cs="MiSans"/>
         </w:rPr>
         <w:tab/>
       </w:r>
@@ -950,7 +1079,7 @@
         <w:rPr>
           <w:rFonts w:hint="eastAsia" w:ascii="MiSans" w:hAnsi="MiSans" w:eastAsia="MiSans" w:cs="MiSans"/>
         </w:rPr>
-        <w:t>活动负责人</w:t>
+        <w:t>云原生微服务 Demo</w:t>
       </w:r>
     </w:p>
     <w:p>
@@ -982,7 +1111,7 @@
         <w:rPr>
           <w:rFonts w:hint="eastAsia" w:ascii="MiSans" w:hAnsi="MiSans" w:eastAsia="MiSans" w:cs="MiSans"/>
         </w:rPr>
-        <w:t>根据物料需求计划发排期给供应商，生产计划变动情况及时调整来货计划，并跟踪供应商按期按量来货；</w:t>
+        <w:t>基于 Go Kit 构建微服务架构，实现服务注册与发现（Consul）、负载均衡及熔断机制；</w:t>
       </w:r>
     </w:p>
     <w:p>
@@ -1000,7 +1129,7 @@
         <w:rPr>
           <w:rFonts w:hint="eastAsia" w:ascii="MiSans" w:hAnsi="MiSans" w:eastAsia="MiSans" w:cs="MiSans"/>
         </w:rPr>
-        <w:t>收集和整理供应商交期的品质表现，定期考核供应商，推动供应商交期，服务和品质方面不断改善；</w:t>
+        <w:t>使用 Docker 容器化部署服务，编写 docker-compose 编排多服务环境；</w:t>
       </w:r>
     </w:p>
     <w:p>
@@ -1018,7 +1147,7 @@
         <w:rPr>
           <w:rFonts w:hint="eastAsia" w:ascii="MiSans" w:hAnsi="MiSans" w:eastAsia="MiSans" w:cs="MiSans"/>
         </w:rPr>
-        <w:t>承担物料采购、现场调配等工作;策划执行“第九届全国大学生绿植领养活动”武汉体育学院站活动，KPI排名全省前 30%；于同年担任班导助理，获得“优秀班干部”</w:t>
+        <w:t>引入 Prometheus + Grafana 进行服务监控，搭建基础可观测性体系</w:t>
       </w:r>
     </w:p>
     <w:p>
@@ -1211,17 +1340,17 @@
           </mc:Choice>
           <mc:Fallback>
             <w:pict>
-              <v:group id="组合 3" o:spid="_x0000_s1026" o:spt="203" style="height:27.65pt;width:507.65pt;" coordorigin="4100,0" coordsize="6447790,351289" o:gfxdata="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">
+              <v:group id="组合 3" o:spid="_x0000_s1026" o:spt="203" style="height:27.65pt;width:507.65pt;" coordorigin="4100,0" coordsize="6447790,351289" o:gfxdata="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">
                 <o:lock v:ext="edit" aspectratio="f"/>
-                <v:group id="组合 3" o:spid="_x0000_s1026" o:spt="203" style="position:absolute;left:4100;top:0;height:351289;width:6447790;" coordorigin="10020,-1462" coordsize="6447881,351289" o:gfxdata="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">
+                <v:group id="组合 3" o:spid="_x0000_s1026" o:spt="203" style="position:absolute;left:4100;top:0;height:351289;width:6447790;" coordorigin="10020,-1462" coordsize="6447881,351289" o:gfxdata="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">
                   <o:lock v:ext="edit" aspectratio="f"/>
-                  <v:line id="直接连接符 1" o:spid="_x0000_s1026" o:spt="20" style="position:absolute;left:10020;top:349827;height:0;width:6447881;" filled="f" stroked="t" coordsize="21600,21600" o:gfxdata="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">
+                  <v:line id="直接连接符 1" o:spid="_x0000_s1026" o:spt="20" style="position:absolute;left:10020;top:349827;height:0;width:6447881;" filled="f" stroked="t" coordsize="21600,21600" o:gfxdata="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">
                     <v:fill on="f" focussize="0,0"/>
                     <v:stroke weight="1pt" color="#BFBFBF" miterlimit="8" joinstyle="miter"/>
                     <v:imagedata o:title=""/>
                     <o:lock v:ext="edit" aspectratio="f"/>
                   </v:line>
-                  <v:rect id="矩形 66" o:spid="_x0000_s1026" o:spt="1" style="position:absolute;left:350758;top:-1462;height:308728;width:1084599;mso-wrap-style:none;v-text-anchor:middle;" filled="f" stroked="f" coordsize="21600,21600" o:gfxdata="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">
+                  <v:rect id="矩形 66" o:spid="_x0000_s1026" o:spt="1" style="position:absolute;left:350758;top:-1462;height:308728;width:1084599;mso-wrap-style:none;v-text-anchor:middle;" filled="f" stroked="f" coordsize="21600,21600" o:gfxdata="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">
                     <v:fill on="f" focussize="0,0"/>
                     <v:stroke on="f" weight="1pt" miterlimit="8" joinstyle="miter"/>
                     <v:imagedata o:title=""/>
@@ -1243,13 +1372,13 @@
                     </v:textbox>
                   </v:rect>
                 </v:group>
-                <v:shape id="椭圆 2" o:spid="_x0000_s1026" o:spt="5" type="#_x0000_t5" style="position:absolute;left:126138;top:67796;height:180148;width:257338;rotation:5898240f;v-text-anchor:middle;" fillcolor="#373D54 [3204]" filled="t" stroked="t" coordsize="21600,21600" o:gfxdata="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" adj="10800">
+                <v:shape id="椭圆 2" o:spid="_x0000_s1026" o:spt="5" type="#_x0000_t5" style="position:absolute;left:126138;top:67796;height:180148;width:257338;rotation:5898240f;v-text-anchor:middle;" fillcolor="#373D54 [3204]" filled="t" stroked="t" coordsize="21600,21600" o:gfxdata="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" adj="10800">
                   <v:fill on="t" focussize="0,0"/>
                   <v:stroke weight="1.5pt" color="#FFFFFF [3212]" miterlimit="8" joinstyle="miter"/>
                   <v:imagedata o:title=""/>
                   <o:lock v:ext="edit" aspectratio="f"/>
                 </v:shape>
-                <v:shape id="椭圆 2" o:spid="_x0000_s1026" o:spt="5" type="#_x0000_t5" style="position:absolute;left:-8248;top:67794;height:180150;width:257340;rotation:5898240f;v-text-anchor:middle;" fillcolor="#373D54 [3204]" filled="t" stroked="t" coordsize="21600,21600" o:gfxdata="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" adj="10800">
+                <v:shape id="椭圆 2" o:spid="_x0000_s1026" o:spt="5" type="#_x0000_t5" style="position:absolute;left:-8248;top:67794;height:180150;width:257340;rotation:5898240f;v-text-anchor:middle;" fillcolor="#373D54 [3204]" filled="t" stroked="t" coordsize="21600,21600" o:gfxdata="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" adj="10800">
                   <v:fill on="t" focussize="0,0"/>
                   <v:stroke weight="1.5pt" color="#FFFFFF [3212]" miterlimit="8" joinstyle="miter"/>
                   <v:imagedata o:title=""/>
@@ -1274,7 +1403,27 @@
         <w:rPr>
           <w:rFonts w:hint="eastAsia" w:ascii="MiSans" w:hAnsi="MiSans" w:eastAsia="MiSans" w:cs="MiSans"/>
         </w:rPr>
-        <w:t>语言能力：英语通过四级考试，口语流利、普通话：流利、粤语：一般</w:t>
+        <w:t>语言能力：英语通过</w:t>
+      </w:r>
+      <w:r>
+        <w:rPr>
+          <w:rFonts w:hint="eastAsia" w:ascii="MiSans" w:hAnsi="MiSans" w:eastAsia="MiSans" w:cs="MiSans"/>
+          <w:lang w:val="en-US" w:eastAsia="zh-CN"/>
+        </w:rPr>
+        <w:t>4</w:t>
+      </w:r>
+      <w:r>
+        <w:rPr>
+          <w:rFonts w:hint="default" w:ascii="MiSans" w:hAnsi="MiSans" w:eastAsia="MiSans" w:cs="MiSans"/>
+          <w:lang w:val="en-US" w:eastAsia="zh-CN"/>
+        </w:rPr>
+        <w:t>,6</w:t>
+      </w:r>
+      <w:r>
+        <w:rPr>
+          <w:rFonts w:hint="eastAsia" w:ascii="MiSans" w:hAnsi="MiSans" w:eastAsia="MiSans" w:cs="MiSans"/>
+        </w:rPr>
+        <w:t>级考试，口语流利、普通话：流利</w:t>
       </w:r>
     </w:p>
     <w:p>
@@ -1288,7 +1437,7 @@
         <w:rPr>
           <w:rFonts w:hint="eastAsia" w:ascii="MiSans" w:hAnsi="MiSans" w:eastAsia="MiSans" w:cs="MiSans"/>
         </w:rPr>
-        <w:t>计算机能力：通过中级考试，计算机操作熟练，能熟练使用WORD\EXCEL\ACCESS等办公自动化软件</w:t>
+        <w:t>计算机能力：熟悉 Golang 编程、Git 协作流程，熟练使用 Linux 常用命令及 Docker 容器化工具</w:t>
       </w:r>
     </w:p>
     <w:p>
@@ -1302,7 +1451,7 @@
         <w:rPr>
           <w:rFonts w:hint="eastAsia" w:ascii="MiSans" w:hAnsi="MiSans" w:eastAsia="MiSans" w:cs="MiSans"/>
         </w:rPr>
-        <w:t>荣誉证书：国际贸易职业资格证、物流贸易从业资格证、三次获国家奖学金</w:t>
+        <w:t>荣誉证书：校奖学金、软件工程专业课程优秀项目奖</w:t>
       </w:r>
     </w:p>
     <w:p>
@@ -1498,17 +1647,17 @@
           </mc:Choice>
           <mc:Fallback>
             <w:pict>
-              <v:group id="组合 3" o:spid="_x0000_s1026" o:spt="203" style="height:27.65pt;width:507.65pt;" coordorigin="4100,0" coordsize="6447790,351289" o:gfxdata="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">
+              <v:group id="组合 3" o:spid="_x0000_s1026" o:spt="203" style="height:27.65pt;width:507.65pt;" coordorigin="4100,0" coordsize="6447790,351289" o:gfxdata="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">
                 <o:lock v:ext="edit" aspectratio="f"/>
-                <v:group id="组合 3" o:spid="_x0000_s1026" o:spt="203" style="position:absolute;left:4100;top:0;height:351289;width:6447790;" coordorigin="10020,-1462" coordsize="6447881,351289" o:gfxdata="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">
+                <v:group id="组合 3" o:spid="_x0000_s1026" o:spt="203" style="position:absolute;left:4100;top:0;height:351289;width:6447790;" coordorigin="10020,-1462" coordsize="6447881,351289" o:gfxdata="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">
                   <o:lock v:ext="edit" aspectratio="f"/>
-                  <v:line id="直接连接符 1" o:spid="_x0000_s1026" o:spt="20" style="position:absolute;left:10020;top:349827;height:0;width:6447881;" filled="f" stroked="t" coordsize="21600,21600" o:gfxdata="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">
+                  <v:line id="直接连接符 1" o:spid="_x0000_s1026" o:spt="20" style="position:absolute;left:10020;top:349827;height:0;width:6447881;" filled="f" stroked="t" coordsize="21600,21600" o:gfxdata="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">
                     <v:fill on="f" focussize="0,0"/>
                     <v:stroke weight="1pt" color="#BFBFBF" miterlimit="8" joinstyle="miter"/>
                     <v:imagedata o:title=""/>
                     <o:lock v:ext="edit" aspectratio="f"/>
                   </v:line>
-                  <v:rect id="矩形 66" o:spid="_x0000_s1026" o:spt="1" style="position:absolute;left:350380;top:-1462;height:308728;width:1084599;mso-wrap-style:none;v-text-anchor:middle;" filled="f" stroked="f" coordsize="21600,21600" o:gfxdata="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">
+                  <v:rect id="矩形 66" o:spid="_x0000_s1026" o:spt="1" style="position:absolute;left:350380;top:-1462;height:308728;width:1084599;mso-wrap-style:none;v-text-anchor:middle;" filled="f" stroked="f" coordsize="21600,21600" o:gfxdata="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">
                     <v:fill on="f" focussize="0,0"/>
                     <v:stroke on="f" weight="1pt" miterlimit="8" joinstyle="miter"/>
                     <v:imagedata o:title=""/>
@@ -1533,13 +1682,13 @@
                     </v:textbox>
                   </v:rect>
                 </v:group>
-                <v:shape id="椭圆 2" o:spid="_x0000_s1026" o:spt="5" type="#_x0000_t5" style="position:absolute;left:126138;top:67796;height:180148;width:257338;rotation:5898240f;v-text-anchor:middle;" fillcolor="#373D54 [3204]" filled="t" stroked="t" coordsize="21600,21600" o:gfxdata="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" adj="10800">
+                <v:shape id="椭圆 2" o:spid="_x0000_s1026" o:spt="5" type="#_x0000_t5" style="position:absolute;left:126138;top:67796;height:180148;width:257338;rotation:5898240f;v-text-anchor:middle;" fillcolor="#373D54 [3204]" filled="t" stroked="t" coordsize="21600,21600" o:gfxdata="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" adj="10800">
                   <v:fill on="t" focussize="0,0"/>
                   <v:stroke weight="1.5pt" color="#FFFFFF [3212]" miterlimit="8" joinstyle="miter"/>
                   <v:imagedata o:title=""/>
                   <o:lock v:ext="edit" aspectratio="f"/>
                 </v:shape>
-                <v:shape id="椭圆 2" o:spid="_x0000_s1026" o:spt="5" type="#_x0000_t5" style="position:absolute;left:-8248;top:67794;height:180150;width:257340;rotation:5898240f;v-text-anchor:middle;" fillcolor="#373D54 [3204]" filled="t" stroked="t" coordsize="21600,21600" o:gfxdata="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" adj="10800">
+                <v:shape id="椭圆 2" o:spid="_x0000_s1026" o:spt="5" type="#_x0000_t5" style="position:absolute;left:-8248;top:67794;height:180150;width:257340;rotation:5898240f;v-text-anchor:middle;" fillcolor="#373D54 [3204]" filled="t" stroked="t" coordsize="21600,21600" o:gfxdata="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" adj="10800">
                   <v:fill on="t" focussize="0,0"/>
                   <v:stroke weight="1.5pt" color="#FFFFFF [3212]" miterlimit="8" joinstyle="miter"/>
                   <v:imagedata o:title=""/>
@@ -1564,28 +1713,10 @@
         <w:rPr>
           <w:rFonts w:hint="eastAsia" w:ascii="MiSans" w:hAnsi="MiSans" w:eastAsia="MiSans" w:cs="MiSans"/>
         </w:rPr>
-        <w:t>我以积极主动的工作态度来迎接工作中的每一个挑战。大学期间我努力学习专业课的同时，获得一种理科思维看待事物。为人随和，能很好的和同学相处。在社团以及学生会的工作不仅锻炼了我的语言表达、沟通以及文字能力，而且使我做事更加认真，更加懂得处理人际关系，练就了较强的组织能力、实际动手能力</w:t>
-      </w:r>
-      <w:r>
-        <w:rPr>
-          <w:rFonts w:hint="eastAsia" w:ascii="MiSans" w:hAnsi="MiSans" w:eastAsia="MiSans" w:cs="MiSans"/>
-          <w:lang w:eastAsia="zh-CN"/>
-        </w:rPr>
-        <w:t>，</w:t>
-      </w:r>
-      <w:r>
-        <w:rPr>
-          <w:rFonts w:hint="eastAsia" w:ascii="MiSans" w:hAnsi="MiSans" w:eastAsia="MiSans" w:cs="MiSans"/>
-          <w:lang w:val="en-US" w:eastAsia="zh-CN"/>
-        </w:rPr>
-        <w:t>且擅长jianlixiazai.cn常态运营活动</w:t>
-      </w:r>
-      <w:r>
-        <w:rPr>
-          <w:rFonts w:hint="eastAsia" w:ascii="MiSans" w:hAnsi="MiSans" w:eastAsia="MiSans" w:cs="MiSans"/>
-        </w:rPr>
-        <w:t>。我乐于接受新鲜事物，有很强的自学能力和适应能力。</w:t>
-      </w:r>
+        <w:t>积极主动，热爱技术，对 Golang 及云原生生态有浓厚兴趣。在校期间系统学习 Golang 程序设计、云原生开发等课程，并独立完成多个 Go 项目，具备良好的编码习惯与问题排查能力。乐于钻研源码与新技术，适应团队协作，善于沟通，致力于在 Golang 后端开发方向持续深耕</w:t>
+      </w:r>
+      <w:bookmarkStart w:id="0" w:name="_GoBack"/>
+      <w:bookmarkEnd w:id="0"/>
     </w:p>
     <w:sectPr>
       <w:headerReference r:id="rId3" w:type="default"/>
@@ -1603,7 +1734,7 @@
 <w:hdr xmlns:wpc="http://schemas.microsoft.com/office/word/2010/wordprocessingCanvas" xmlns:mc="http://schemas.openxmlformats.org/markup-compatibility/2006" xmlns:o="urn:schemas-microsoft-com:office:office" xmlns:r="http://schemas.openxmlformats.org/officeDocument/2006/relationships" xmlns:m="http://schemas.openxmlformats.org/officeDocument/2006/math" xmlns:v="urn:schemas-microsoft-com:vml" xmlns:wp14="http://schemas.microsoft.com/office/word/2010/wordprocessingDrawing" xmlns:wp="http://schemas.openxmlformats.org/drawingml/2006/wordprocessingDrawing" xmlns:w10="urn:schemas-microsoft-com:office:word" xmlns:w="http://schemas.openxmlformats.org/wordprocessingml/2006/main" xmlns:w14="http://schemas.microsoft.com/office/word/2010/wordml" xmlns:w15="http://schemas.microsoft.com/office/word/2012/wordml" xmlns:wpg="http://schemas.microsoft.com/office/word/2010/wordprocessingGroup" xmlns:wpi="http://schemas.microsoft.com/office/word/2010/wordprocessingInk" xmlns:wne="http://schemas.microsoft.com/office/word/2006/wordml" xmlns:wps="http://schemas.microsoft.com/office/word/2010/wordprocessingShape" xmlns:wpsCustomData="http://www.wps.cn/officeDocument/2013/wpsCustomData" mc:Ignorable="w14 w15 wp14">
   <w:p>
     <w:pPr>
-      <w:pStyle w:val="5"/>
+      <w:pStyle w:val="6"/>
     </w:pPr>
     <w:r>
       <w:rPr>
@@ -1710,16 +1841,16 @@
         </mc:Choice>
         <mc:Fallback>
           <w:pict>
-            <v:group id="组合 2" o:spid="_x0000_s1026" o:spt="203" style="position:absolute;left:0pt;height:840.75pt;width:594.7pt;mso-position-horizontal:left;mso-position-horizontal-relative:page;mso-position-vertical:top;mso-position-vertical-relative:page;z-index:251661312;mso-width-relative:page;mso-height-relative:page;" coordsize="7552690,10675620" o:gfxdata="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">
+            <v:group id="组合 2" o:spid="_x0000_s1026" o:spt="203" style="position:absolute;left:0pt;height:840.75pt;width:594.7pt;mso-position-horizontal:left;mso-position-horizontal-relative:page;mso-position-vertical:top;mso-position-vertical-relative:page;z-index:251661312;mso-width-relative:page;mso-height-relative:page;" coordsize="7552690,10675620" o:gfxdata="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">
               <o:lock v:ext="edit" aspectratio="f"/>
-              <v:shape id="Rectangle 23_637909051971450009_11" o:spid="_x0000_s1026" style="position:absolute;left:0;top:0;height:10675620;width:7552690;v-text-anchor:middle;" fillcolor="#373D54 [3204]" filled="t" stroked="f" coordsize="7552690,10675620" o:gfxdata="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" path="m0,0l7552690,0,7552690,10675620,0,10675620xm219707,219707l219707,10455912,7332982,10455912,7332982,219707xe">
+              <v:shape id="Rectangle 23_637909051971450009_11" o:spid="_x0000_s1026" style="position:absolute;left:0;top:0;height:10675620;width:7552690;v-text-anchor:middle;" fillcolor="#373D54 [3204]" filled="t" stroked="f" coordsize="7552690,10675620" o:gfxdata="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" path="m0,0l7552690,0,7552690,10675620,0,10675620xm219707,219707l219707,10455912,7332982,10455912,7332982,219707xe">
                 <v:path o:connectlocs="3776345,0;0,5337810;3776345,10675620;7552690,5337810" o:connectangles="247,164,82,0"/>
                 <v:fill on="t" focussize="0,0"/>
                 <v:stroke on="f" weight="1pt" miterlimit="8" joinstyle="miter"/>
                 <v:imagedata o:title=""/>
                 <o:lock v:ext="edit" aspectratio="f"/>
               </v:shape>
-              <v:rect id="矩形 1" o:spid="_x0000_s1026" o:spt="1" style="position:absolute;left:2788475;top:0;height:349250;width:1924050;v-text-anchor:middle;" fillcolor="#9B2D1F [3205]" filled="t" stroked="f" coordsize="21600,21600" o:gfxdata="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">
+              <v:rect id="矩形 1" o:spid="_x0000_s1026" o:spt="1" style="position:absolute;left:2788475;top:0;height:349250;width:1924050;v-text-anchor:middle;" fillcolor="#9B2D1F [3205]" filled="t" stroked="f" coordsize="21600,21600" o:gfxdata="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">
                 <v:fill on="t" focussize="0,0"/>
                 <v:stroke on="f" weight="1pt" miterlimit="8" joinstyle="miter"/>
                 <v:imagedata o:title=""/>
@@ -2093,7 +2224,7 @@
   <w:docDefaults>
     <w:rPrDefault>
       <w:rPr>
-        <w:rFonts w:asciiTheme="minorHAnsi" w:hAnsiTheme="minorHAnsi" w:eastAsiaTheme="minorEastAsia" w:cstheme="minorBidi"/>
+        <w:rFonts w:ascii="Times New Roman" w:hAnsi="Times New Roman" w:eastAsia="宋体" w:cs="Times New Roman"/>
       </w:rPr>
     </w:rPrDefault>
     <w:pPrDefault/>
@@ -2367,14 +2498,14 @@
       <w14:ligatures w14:val="standardContextual"/>
     </w:rPr>
   </w:style>
-  <w:style w:type="character" w:default="1" w:styleId="8">
+  <w:style w:type="character" w:default="1" w:styleId="2">
     <w:name w:val="Default Paragraph Font"/>
     <w:semiHidden/>
     <w:unhideWhenUsed/>
     <w:qFormat/>
     <w:uiPriority w:val="1"/>
   </w:style>
-  <w:style w:type="table" w:default="1" w:styleId="6">
+  <w:style w:type="table" w:default="1" w:styleId="3">
     <w:name w:val="Normal Table"/>
     <w:semiHidden/>
     <w:unhideWhenUsed/>
@@ -2389,21 +2520,7 @@
       </w:tblCellMar>
     </w:tblPr>
   </w:style>
-  <w:style w:type="paragraph" w:styleId="2">
-    <w:name w:val="Salutation"/>
-    <w:basedOn w:val="1"/>
-    <w:next w:val="1"/>
-    <w:link w:val="70"/>
-    <w:unhideWhenUsed/>
-    <w:qFormat/>
-    <w:uiPriority w:val="99"/>
-    <w:rPr>
-      <w:rFonts w:asciiTheme="minorHAnsi" w:hAnsiTheme="minorHAnsi" w:cstheme="minorBidi"/>
-      <w:sz w:val="24"/>
-      <w:szCs w:val="22"/>
-    </w:rPr>
-  </w:style>
-  <w:style w:type="paragraph" w:styleId="3">
+  <w:style w:type="paragraph" w:styleId="4">
     <w:name w:val="Closing"/>
     <w:basedOn w:val="1"/>
     <w:link w:val="71"/>
@@ -2419,7 +2536,7 @@
       <w:szCs w:val="22"/>
     </w:rPr>
   </w:style>
-  <w:style w:type="paragraph" w:styleId="4">
+  <w:style w:type="paragraph" w:styleId="5">
     <w:name w:val="footer"/>
     <w:basedOn w:val="1"/>
     <w:link w:val="11"/>
@@ -2438,7 +2555,7 @@
       <w:szCs w:val="18"/>
     </w:rPr>
   </w:style>
-  <w:style w:type="paragraph" w:styleId="5">
+  <w:style w:type="paragraph" w:styleId="6">
     <w:name w:val="header"/>
     <w:basedOn w:val="1"/>
     <w:link w:val="10"/>
@@ -2457,9 +2574,39 @@
       <w:szCs w:val="18"/>
     </w:rPr>
   </w:style>
-  <w:style w:type="table" w:styleId="7">
+  <w:style w:type="character" w:styleId="7">
+    <w:name w:val="Hyperlink"/>
+    <w:basedOn w:val="2"/>
+    <w:unhideWhenUsed/>
+    <w:qFormat/>
+    <w:uiPriority w:val="99"/>
+    <w:rPr>
+      <w:color w:val="CC9900" w:themeColor="hyperlink"/>
+      <w:u w:val="single"/>
+      <w14:textFill>
+        <w14:solidFill>
+          <w14:schemeClr w14:val="hlink"/>
+        </w14:solidFill>
+      </w14:textFill>
+    </w:rPr>
+  </w:style>
+  <w:style w:type="paragraph" w:styleId="8">
+    <w:name w:val="Salutation"/>
+    <w:basedOn w:val="1"/>
+    <w:next w:val="1"/>
+    <w:link w:val="70"/>
+    <w:unhideWhenUsed/>
+    <w:qFormat/>
+    <w:uiPriority w:val="99"/>
+    <w:rPr>
+      <w:rFonts w:asciiTheme="minorHAnsi" w:hAnsiTheme="minorHAnsi" w:cstheme="minorBidi"/>
+      <w:sz w:val="24"/>
+      <w:szCs w:val="22"/>
+    </w:rPr>
+  </w:style>
+  <w:style w:type="table" w:styleId="9">
     <w:name w:val="Table Grid"/>
-    <w:basedOn w:val="6"/>
+    <w:basedOn w:val="3"/>
     <w:qFormat/>
     <w:uiPriority w:val="39"/>
     <w:tblPr>
@@ -2473,26 +2620,10 @@
       </w:tblBorders>
     </w:tblPr>
   </w:style>
-  <w:style w:type="character" w:styleId="9">
-    <w:name w:val="Hyperlink"/>
-    <w:basedOn w:val="8"/>
-    <w:unhideWhenUsed/>
-    <w:qFormat/>
-    <w:uiPriority w:val="99"/>
-    <w:rPr>
-      <w:color w:val="CC9900" w:themeColor="hyperlink"/>
-      <w:u w:val="single"/>
-      <w14:textFill>
-        <w14:solidFill>
-          <w14:schemeClr w14:val="hlink"/>
-        </w14:solidFill>
-      </w14:textFill>
-    </w:rPr>
-  </w:style>
   <w:style w:type="character" w:customStyle="1" w:styleId="10">
     <w:name w:val="页眉 字符"/>
-    <w:basedOn w:val="8"/>
-    <w:link w:val="5"/>
+    <w:basedOn w:val="2"/>
+    <w:link w:val="6"/>
     <w:qFormat/>
     <w:uiPriority w:val="99"/>
     <w:rPr>
@@ -2502,8 +2633,8 @@
   </w:style>
   <w:style w:type="character" w:customStyle="1" w:styleId="11">
     <w:name w:val="页脚 字符"/>
-    <w:basedOn w:val="8"/>
-    <w:link w:val="4"/>
+    <w:basedOn w:val="2"/>
+    <w:link w:val="5"/>
     <w:qFormat/>
     <w:uiPriority w:val="99"/>
     <w:rPr>
@@ -2885,7 +3016,7 @@
   </w:style>
   <w:style w:type="character" w:customStyle="1" w:styleId="29">
     <w:name w:val="简历_个人信息_姓名_段落 字符"/>
-    <w:basedOn w:val="8"/>
+    <w:basedOn w:val="2"/>
     <w:link w:val="12"/>
     <w:qFormat/>
     <w:uiPriority w:val="0"/>
@@ -2945,7 +3076,7 @@
   </w:style>
   <w:style w:type="character" w:customStyle="1" w:styleId="32">
     <w:name w:val="简历_个人信息_正文_段落 字符"/>
-    <w:basedOn w:val="8"/>
+    <w:basedOn w:val="2"/>
     <w:link w:val="14"/>
     <w:qFormat/>
     <w:uiPriority w:val="0"/>
@@ -3001,7 +3132,7 @@
   </w:style>
   <w:style w:type="character" w:customStyle="1" w:styleId="35">
     <w:name w:val="简历_个人信息_装饰_文本框 字符"/>
-    <w:basedOn w:val="8"/>
+    <w:basedOn w:val="2"/>
     <w:link w:val="25"/>
     <w:uiPriority w:val="0"/>
     <w:rPr>
@@ -3040,7 +3171,7 @@
   </w:style>
   <w:style w:type="character" w:customStyle="1" w:styleId="38">
     <w:name w:val="简历_内容副区_副标题_段落 字符"/>
-    <w:basedOn w:val="8"/>
+    <w:basedOn w:val="2"/>
     <w:link w:val="22"/>
     <w:qFormat/>
     <w:uiPriority w:val="0"/>
@@ -3132,7 +3263,7 @@
   </w:style>
   <w:style w:type="character" w:customStyle="1" w:styleId="45">
     <w:name w:val="简历_内容副区_正文_段落 字符"/>
-    <w:basedOn w:val="8"/>
+    <w:basedOn w:val="2"/>
     <w:link w:val="21"/>
     <w:qFormat/>
     <w:uiPriority w:val="0"/>
@@ -3178,7 +3309,7 @@
   </w:style>
   <w:style w:type="character" w:customStyle="1" w:styleId="48">
     <w:name w:val="简历_内容主区_副标题_段落 字符"/>
-    <w:basedOn w:val="8"/>
+    <w:basedOn w:val="2"/>
     <w:link w:val="19"/>
     <w:qFormat/>
     <w:uiPriority w:val="0"/>
@@ -3232,7 +3363,7 @@
   </w:style>
   <w:style w:type="character" w:customStyle="1" w:styleId="51">
     <w:name w:val="简历_内容主区_三级标题_段落 字符"/>
-    <w:basedOn w:val="8"/>
+    <w:basedOn w:val="2"/>
     <w:link w:val="18"/>
     <w:qFormat/>
     <w:uiPriority w:val="0"/>
@@ -3287,7 +3418,7 @@
   </w:style>
   <w:style w:type="character" w:customStyle="1" w:styleId="54">
     <w:name w:val="简历_内容主区_正文_文本框 字符"/>
-    <w:basedOn w:val="8"/>
+    <w:basedOn w:val="2"/>
     <w:link w:val="20"/>
     <w:qFormat/>
     <w:uiPriority w:val="0"/>
@@ -3609,7 +3740,7 @@
   </w:style>
   <w:style w:type="character" w:customStyle="1" w:styleId="69">
     <w:name w:val="简历_封面_正文_文本框 字符"/>
-    <w:basedOn w:val="8"/>
+    <w:basedOn w:val="2"/>
     <w:link w:val="68"/>
     <w:qFormat/>
     <w:uiPriority w:val="0"/>
@@ -3622,8 +3753,8 @@
   </w:style>
   <w:style w:type="character" w:customStyle="1" w:styleId="70">
     <w:name w:val="称呼 字符"/>
-    <w:basedOn w:val="8"/>
-    <w:link w:val="2"/>
+    <w:basedOn w:val="2"/>
+    <w:link w:val="8"/>
     <w:qFormat/>
     <w:uiPriority w:val="99"/>
     <w:rPr>
@@ -3635,8 +3766,8 @@
   </w:style>
   <w:style w:type="character" w:customStyle="1" w:styleId="71">
     <w:name w:val="结束语 字符"/>
-    <w:basedOn w:val="8"/>
-    <w:link w:val="3"/>
+    <w:basedOn w:val="2"/>
+    <w:link w:val="4"/>
     <w:qFormat/>
     <w:uiPriority w:val="99"/>
     <w:rPr>
@@ -3648,7 +3779,7 @@
   </w:style>
   <w:style w:type="character" w:customStyle="1" w:styleId="72">
     <w:name w:val="简历_内容主区_大标题_文本框 字符"/>
-    <w:basedOn w:val="8"/>
+    <w:basedOn w:val="2"/>
     <w:link w:val="26"/>
     <w:qFormat/>
     <w:uiPriority w:val="0"/>
@@ -3694,7 +3825,7 @@
   </w:style>
   <w:style w:type="character" w:customStyle="1" w:styleId="74">
     <w:name w:val="简历_附录_标题_段落 字符"/>
-    <w:basedOn w:val="8"/>
+    <w:basedOn w:val="2"/>
     <w:link w:val="73"/>
     <w:qFormat/>
     <w:uiPriority w:val="0"/>
@@ -3731,7 +3862,7 @@
   </w:style>
   <w:style w:type="character" w:customStyle="1" w:styleId="76">
     <w:name w:val="简历_附录_正文_段落 字符"/>
-    <w:basedOn w:val="8"/>
+    <w:basedOn w:val="2"/>
     <w:link w:val="75"/>
     <w:uiPriority w:val="0"/>
     <w:rPr>
@@ -3772,7 +3903,7 @@
   </w:style>
   <w:style w:type="character" w:customStyle="1" w:styleId="79">
     <w:name w:val="Unresolved Mention"/>
-    <w:basedOn w:val="8"/>
+    <w:basedOn w:val="2"/>
     <w:semiHidden/>
     <w:unhideWhenUsed/>
     <w:qFormat/>
@@ -3982,15 +4113,13 @@
 
 <file path=customXml/item1.xml><?xml version="1.0" encoding="utf-8"?>
 <s:customData xmlns="http://www.wps.cn/officeDocument/2013/wpsCustomData" xmlns:s="http://www.wps.cn/officeDocument/2013/wpsCustomData">
-  <customSectProps/>
+  <customSectProps>
+    <customSectPr/>
+  </customSectProps>
   <customShpExts>
     <customShpInfo spid="_x0000_s1026" textRotate="1"/>
   </customShpExts>
 </s:customData>
-</file>
-
-<file path=customXml/item2.xml><?xml version="1.0" encoding="utf-8"?>
-<b:Sources xmlns:b="http://schemas.openxmlformats.org/officeDocument/2006/bibliography" xmlns="http://schemas.openxmlformats.org/officeDocument/2006/bibliography" SelectedStyle="\APASixthEditionOfficeOnline.xsl" StyleName="APA" Version="6"/>
 </file>
 
 <file path=customXml/itemProps1.xml><?xml version="1.0" encoding="utf-8"?>
@@ -3999,10 +4128,4 @@
     <ds:schemaRef ds:uri="http://www.wps.cn/officeDocument/2013/wpsCustomData"/>
   </ds:schemaRefs>
 </ds:datastoreItem>
-</file>
-
-<file path=customXml/itemProps2.xml><?xml version="1.0" encoding="utf-8"?>
-<ds:datastoreItem xmlns:ds="http://schemas.openxmlformats.org/officeDocument/2006/customXml" ds:itemID="{B7F5357A-8A25-4528-908C-62C9FDACB5EB}">
-  <ds:schemaRefs/>
-</ds:datastoreItem>
 </file>
</xml_diff>